<commit_message>
Multi-tenant : auth email/mdp, settings par cabinet, DocuSign/INPI configurables
- Supabase Auth (email + password) remplace le mdp global
- Middleware Next.js vérifie la session JWT
- Inscription /register : nom cabinet, email, mdp
- Settings par user : cabinet, DocuSign, INPI
- clients et settings filtrés par user_id + RLS
- DocuSign lit les clés depuis settings (plus de .env obligatoire)
- Bouton Déconnexion dans le header

SQL migration : lib/migration-multi-tenant.sql

Co-Authored-By: Claude Sonnet 4.6 <noreply@anthropic.com>
</commit_message>
<xml_diff>
--- a/templates/sasu/statuts.docx
+++ b/templates/sasu/statuts.docx
@@ -219,7 +219,7 @@
           <w:sz w:val="32"/>
           <w:szCs w:val="32"/>
         </w:rPr>
-        <w:t>Siege</w:t>
+        <w:t>Siège</w:t>
       </w:r>
       <w:r>
         <w:rPr>
@@ -241,7 +241,7 @@
           <w:sz w:val="32"/>
           <w:szCs w:val="32"/>
         </w:rPr>
-        <w:t xml:space="preserve">{siege_social} de Flandre </w:t>
+        <w:t xml:space="preserve">{siege_social_debut}</w:t>
       </w:r>
     </w:p>
     <w:p>
@@ -257,7 +257,7 @@
           <w:sz w:val="32"/>
           <w:szCs w:val="32"/>
         </w:rPr>
-        <w:t xml:space="preserve">75019 {ville_siege} </w:t>
+        <w:t xml:space="preserve">75019 Paris </w:t>
       </w:r>
     </w:p>
     <w:p>
@@ -438,7 +438,7 @@
       <w:bookmarkStart w:id="1" w:name="_Hlk19095243"/>
       <w:r>
         <w:lastRenderedPageBreak/>
-        <w:t>{denomination}</w:t>
+        <w:t>NA2G CONSEIL</w:t>
       </w:r>
     </w:p>
     <w:p>
@@ -538,7 +538,7 @@
         <w:rPr>
           <w:rFonts w:ascii="Tahoma" w:hAnsi="Tahoma" w:cs="Tahoma"/>
         </w:rPr>
-        <w:t xml:space="preserve">{civilite} </w:t>
+        <w:t xml:space="preserve">Monsieur </w:t>
       </w:r>
       <w:r>
         <w:rPr>
@@ -565,28 +565,28 @@
           <w:rFonts w:ascii="Tahoma" w:eastAsia="Times New Roman" w:hAnsi="Tahoma" w:cs="Tahoma"/>
           <w:lang w:eastAsia="fr-FR"/>
         </w:rPr>
-        <w:t>{date_naissance_j}</w:t>
-      </w:r>
-      <w:r>
-        <w:rPr>
-          <w:rFonts w:ascii="Tahoma" w:eastAsia="Times New Roman" w:hAnsi="Tahoma" w:cs="Tahoma"/>
-          <w:lang w:eastAsia="fr-FR"/>
-        </w:rPr>
-        <w:t>/{date_naissance_m1}</w:t>
-      </w:r>
-      <w:r>
-        <w:rPr>
-          <w:rFonts w:ascii="Tahoma" w:eastAsia="Times New Roman" w:hAnsi="Tahoma" w:cs="Tahoma"/>
-          <w:lang w:eastAsia="fr-FR"/>
-        </w:rPr>
-        <w:t>{date_naissance_m2}</w:t>
-      </w:r>
-      <w:r>
-        <w:rPr>
-          <w:rFonts w:ascii="Tahoma" w:eastAsia="Times New Roman" w:hAnsi="Tahoma" w:cs="Tahoma"/>
-          <w:lang w:eastAsia="fr-FR"/>
-        </w:rPr>
-        <w:t xml:space="preserve">{date_naissance_a} à </w:t>
+        <w:t>{date_naissance}</w:t>
+      </w:r>
+      <w:r>
+        <w:rPr>
+          <w:rFonts w:ascii="Tahoma" w:eastAsia="Times New Roman" w:hAnsi="Tahoma" w:cs="Tahoma"/>
+          <w:lang w:eastAsia="fr-FR"/>
+        </w:rPr>
+        <w:t/>
+      </w:r>
+      <w:r>
+        <w:rPr>
+          <w:rFonts w:ascii="Tahoma" w:eastAsia="Times New Roman" w:hAnsi="Tahoma" w:cs="Tahoma"/>
+          <w:lang w:eastAsia="fr-FR"/>
+        </w:rPr>
+        <w:t/>
+      </w:r>
+      <w:r>
+        <w:rPr>
+          <w:rFonts w:ascii="Tahoma" w:eastAsia="Times New Roman" w:hAnsi="Tahoma" w:cs="Tahoma"/>
+          <w:lang w:eastAsia="fr-FR"/>
+        </w:rPr>
+        <w:t xml:space="preserve"> à </w:t>
       </w:r>
       <w:r>
         <w:rPr>
@@ -621,7 +621,21 @@
           <w:rFonts w:ascii="Tahoma" w:eastAsia="Times New Roman" w:hAnsi="Tahoma" w:cs="Tahoma"/>
           <w:lang w:eastAsia="fr-FR"/>
         </w:rPr>
-        <w:t xml:space="preserve"> {siege_social}</w:t>
+        <w:t xml:space="preserve">{adresse_debut}</w:t>
+      </w:r>
+      <w:r>
+        <w:rPr>
+          <w:rFonts w:ascii="Tahoma" w:eastAsia="Times New Roman" w:hAnsi="Tahoma" w:cs="Tahoma"/>
+          <w:lang w:eastAsia="fr-FR"/>
+        </w:rPr>
+        <w:t xml:space="preserve"/>
+      </w:r>
+      <w:r>
+        <w:rPr>
+          <w:rFonts w:ascii="Tahoma" w:eastAsia="Times New Roman" w:hAnsi="Tahoma" w:cs="Tahoma"/>
+          <w:lang w:eastAsia="fr-FR"/>
+        </w:rPr>
+        <w:t/>
       </w:r>
       <w:r>
         <w:rPr>
@@ -636,20 +650,6 @@
           <w:lang w:eastAsia="fr-FR"/>
         </w:rPr>
         <w:t/>
-      </w:r>
-      <w:r>
-        <w:rPr>
-          <w:rFonts w:ascii="Tahoma" w:eastAsia="Times New Roman" w:hAnsi="Tahoma" w:cs="Tahoma"/>
-          <w:lang w:eastAsia="fr-FR"/>
-        </w:rPr>
-        <w:t xml:space="preserve"> </w:t>
-      </w:r>
-      <w:r>
-        <w:rPr>
-          <w:rFonts w:ascii="Tahoma" w:eastAsia="Times New Roman" w:hAnsi="Tahoma" w:cs="Tahoma"/>
-          <w:lang w:eastAsia="fr-FR"/>
-        </w:rPr>
-        <w:t>{ville_siege}</w:t>
       </w:r>
       <w:r>
         <w:rPr>
@@ -3892,7 +3892,7 @@
         <w:rPr>
           <w:rFonts w:ascii="Tahoma" w:hAnsi="Tahoma" w:cs="Tahoma"/>
         </w:rPr>
-        <w:t xml:space="preserve">{civilite} </w:t>
+        <w:t xml:space="preserve">Monsieur </w:t>
       </w:r>
       <w:r>
         <w:rPr>
@@ -3912,28 +3912,28 @@
           <w:rFonts w:ascii="Tahoma" w:eastAsia="Times New Roman" w:hAnsi="Tahoma" w:cs="Tahoma"/>
           <w:lang w:eastAsia="fr-FR"/>
         </w:rPr>
-        <w:t>{date_naissance_j}</w:t>
-      </w:r>
-      <w:r>
-        <w:rPr>
-          <w:rFonts w:ascii="Tahoma" w:eastAsia="Times New Roman" w:hAnsi="Tahoma" w:cs="Tahoma"/>
-          <w:lang w:eastAsia="fr-FR"/>
-        </w:rPr>
-        <w:t>/{date_naissance_m1}</w:t>
-      </w:r>
-      <w:r>
-        <w:rPr>
-          <w:rFonts w:ascii="Tahoma" w:eastAsia="Times New Roman" w:hAnsi="Tahoma" w:cs="Tahoma"/>
-          <w:lang w:eastAsia="fr-FR"/>
-        </w:rPr>
-        <w:t>{date_naissance_m2}</w:t>
-      </w:r>
-      <w:r>
-        <w:rPr>
-          <w:rFonts w:ascii="Tahoma" w:eastAsia="Times New Roman" w:hAnsi="Tahoma" w:cs="Tahoma"/>
-          <w:lang w:eastAsia="fr-FR"/>
-        </w:rPr>
-        <w:t xml:space="preserve">{date_naissance_a} à </w:t>
+        <w:t>{date_naissance}</w:t>
+      </w:r>
+      <w:r>
+        <w:rPr>
+          <w:rFonts w:ascii="Tahoma" w:eastAsia="Times New Roman" w:hAnsi="Tahoma" w:cs="Tahoma"/>
+          <w:lang w:eastAsia="fr-FR"/>
+        </w:rPr>
+        <w:t/>
+      </w:r>
+      <w:r>
+        <w:rPr>
+          <w:rFonts w:ascii="Tahoma" w:eastAsia="Times New Roman" w:hAnsi="Tahoma" w:cs="Tahoma"/>
+          <w:lang w:eastAsia="fr-FR"/>
+        </w:rPr>
+        <w:t/>
+      </w:r>
+      <w:r>
+        <w:rPr>
+          <w:rFonts w:ascii="Tahoma" w:eastAsia="Times New Roman" w:hAnsi="Tahoma" w:cs="Tahoma"/>
+          <w:lang w:eastAsia="fr-FR"/>
+        </w:rPr>
+        <w:t xml:space="preserve"> à </w:t>
       </w:r>
       <w:r>
         <w:rPr>
@@ -3968,7 +3968,21 @@
           <w:rFonts w:ascii="Tahoma" w:eastAsia="Times New Roman" w:hAnsi="Tahoma" w:cs="Tahoma"/>
           <w:lang w:eastAsia="fr-FR"/>
         </w:rPr>
-        <w:t xml:space="preserve"> {siege_social}</w:t>
+        <w:t xml:space="preserve">{adresse_debut}</w:t>
+      </w:r>
+      <w:r>
+        <w:rPr>
+          <w:rFonts w:ascii="Tahoma" w:eastAsia="Times New Roman" w:hAnsi="Tahoma" w:cs="Tahoma"/>
+          <w:lang w:eastAsia="fr-FR"/>
+        </w:rPr>
+        <w:t xml:space="preserve"/>
+      </w:r>
+      <w:r>
+        <w:rPr>
+          <w:rFonts w:ascii="Tahoma" w:eastAsia="Times New Roman" w:hAnsi="Tahoma" w:cs="Tahoma"/>
+          <w:lang w:eastAsia="fr-FR"/>
+        </w:rPr>
+        <w:t/>
       </w:r>
       <w:r>
         <w:rPr>
@@ -3983,20 +3997,6 @@
           <w:lang w:eastAsia="fr-FR"/>
         </w:rPr>
         <w:t/>
-      </w:r>
-      <w:r>
-        <w:rPr>
-          <w:rFonts w:ascii="Tahoma" w:eastAsia="Times New Roman" w:hAnsi="Tahoma" w:cs="Tahoma"/>
-          <w:lang w:eastAsia="fr-FR"/>
-        </w:rPr>
-        <w:t xml:space="preserve"> </w:t>
-      </w:r>
-      <w:r>
-        <w:rPr>
-          <w:rFonts w:ascii="Tahoma" w:eastAsia="Times New Roman" w:hAnsi="Tahoma" w:cs="Tahoma"/>
-          <w:lang w:eastAsia="fr-FR"/>
-        </w:rPr>
-        <w:t>{ville_siege}</w:t>
       </w:r>
     </w:p>
     <w:p>
@@ -4027,7 +4027,7 @@
         <w:rPr>
           <w:rFonts w:ascii="Tahoma" w:hAnsi="Tahoma" w:cs="Tahoma"/>
         </w:rPr>
-        <w:t xml:space="preserve">{civilite} </w:t>
+        <w:t xml:space="preserve">Monsieur </w:t>
       </w:r>
       <w:r>
         <w:rPr>
@@ -4079,7 +4079,7 @@
         <w:t xml:space="preserve"> - Actes accomplis pour le compte de la Société en formation</w:t>
       </w:r>
     </w:p>
-    <w:p w14:textId="5E0{siege_social}E0">
+    <w:p>
       <w:pPr>
         <w:rPr>
           <w:rFonts w:ascii="Tahoma" w:hAnsi="Tahoma" w:cs="Tahoma"/>

</xml_diff>

<commit_message>
Fix variables: placeholders complets dans common, {objet_social} dans statuts.docx
</commit_message>
<xml_diff>
--- a/templates/sasu/statuts.docx
+++ b/templates/sasu/statuts.docx
@@ -835,11 +835,7 @@
     </w:p>
     <w:p>
       <w:pPr>
-        <w:numPr>
-          <w:ilvl w:val="0"/>
-          <w:numId w:val="9"/>
-        </w:numPr>
-        <w:spacing w:before="100" w:beforeAutospacing="1" w:after="100" w:afterAutospacing="1" w:line="240" w:lineRule="auto"/>
+        <w:spacing w:before="100" w:after="100" w:line="240" w:lineRule="auto"/>
         <w:rPr>
           <w:rFonts w:ascii="Tahoma" w:hAnsi="Tahoma" w:cs="Tahoma"/>
         </w:rPr>
@@ -848,61 +844,7 @@
         <w:rPr>
           <w:rFonts w:ascii="Tahoma" w:hAnsi="Tahoma" w:cs="Tahoma"/>
         </w:rPr>
-        <w:t>Régie commerciale, développement commercial, apporteurs d'affaires, call-center, prise de rendez-vous, commissions sur ventes, intermédiations, en France et à l’international.</w:t>
-      </w:r>
-    </w:p>
-    <w:p>
-      <w:pPr>
-        <w:numPr>
-          <w:ilvl w:val="0"/>
-          <w:numId w:val="9"/>
-        </w:numPr>
-        <w:spacing w:before="100" w:beforeAutospacing="1" w:after="100" w:afterAutospacing="1" w:line="240" w:lineRule="auto"/>
-        <w:rPr>
-          <w:rFonts w:ascii="Tahoma" w:hAnsi="Tahoma" w:cs="Tahoma"/>
-        </w:rPr>
-      </w:pPr>
-      <w:r>
-        <w:rPr>
-          <w:rFonts w:ascii="Tahoma" w:hAnsi="Tahoma" w:cs="Tahoma"/>
-        </w:rPr>
-        <w:t>Ventes et achats en France et à l’international</w:t>
-      </w:r>
-    </w:p>
-    <w:p>
-      <w:pPr>
-        <w:numPr>
-          <w:ilvl w:val="0"/>
-          <w:numId w:val="9"/>
-        </w:numPr>
-        <w:spacing w:before="100" w:beforeAutospacing="1" w:after="100" w:afterAutospacing="1" w:line="240" w:lineRule="auto"/>
-        <w:rPr>
-          <w:rFonts w:ascii="Tahoma" w:hAnsi="Tahoma" w:cs="Tahoma"/>
-        </w:rPr>
-      </w:pPr>
-      <w:r>
-        <w:rPr>
-          <w:rFonts w:ascii="Tahoma" w:hAnsi="Tahoma" w:cs="Tahoma"/>
-        </w:rPr>
-        <w:t xml:space="preserve">La participation de la Société, par tous moyens, à toutes entreprises ou sociétés créées ou à créer, pouvant se rattacher à l'objet social, notamment par voie de création de sociétés nouvelles, d'apport, commandite, souscription ou rachat de titres ou droits sociaux, fusion, alliance ou association en participation ou groupement d'intérêt économique ou de location gérance de tous fonds de commerce. </w:t>
-      </w:r>
-    </w:p>
-    <w:p>
-      <w:pPr>
-        <w:numPr>
-          <w:ilvl w:val="0"/>
-          <w:numId w:val="9"/>
-        </w:numPr>
-        <w:spacing w:before="100" w:beforeAutospacing="1" w:after="100" w:afterAutospacing="1" w:line="240" w:lineRule="auto"/>
-        <w:rPr>
-          <w:rFonts w:ascii="Tahoma" w:hAnsi="Tahoma" w:cs="Tahoma"/>
-        </w:rPr>
-      </w:pPr>
-      <w:r>
-        <w:rPr>
-          <w:rFonts w:ascii="Tahoma" w:hAnsi="Tahoma" w:cs="Tahoma"/>
-        </w:rPr>
-        <w:t>Et plus généralement, toutes opérations industrielles, commerciales et financières, mobilières et immobilières pouvant se rattacher directement ou indirectement à l'objet social et à tous objets similaires ou connexes pouvant favoriser son extension ou son développement.</w:t>
+        <w:t>{objet_social}</w:t>
       </w:r>
     </w:p>
     <w:p>

</xml_diff>

<commit_message>
Statuts: tiret regex robuste, adresse_cp/ville auto-extract, sans parentheses cp_naissance
</commit_message>
<xml_diff>
--- a/templates/sasu/statuts.docx
+++ b/templates/sasu/statuts.docx
@@ -621,14 +621,7 @@
           <w:rFonts w:ascii="Tahoma" w:eastAsia="Times New Roman" w:hAnsi="Tahoma" w:cs="Tahoma"/>
           <w:lang w:eastAsia="fr-FR"/>
         </w:rPr>
-        <w:t xml:space="preserve">{adresse_debut}</w:t>
-      </w:r>
-      <w:r>
-        <w:rPr>
-          <w:rFonts w:ascii="Tahoma" w:eastAsia="Times New Roman" w:hAnsi="Tahoma" w:cs="Tahoma"/>
-          <w:lang w:eastAsia="fr-FR"/>
-        </w:rPr>
-        <w:t xml:space="preserve"/>
+        <w:t xml:space="preserve">{adresse_debut}, {adresse_cp} {adresse_ville}</w:t>
       </w:r>
       <w:r>
         <w:rPr>

</xml_diff>